<commit_message>
fix: corregir placeholders y usar plantilla en generación
</commit_message>
<xml_diff>
--- a/templates/ANEXO01_template.docx
+++ b/templates/ANEXO01_template.docx
@@ -622,6 +622,29 @@
           </w:tcPr>
           <w:p>
             <w:pPr>
+              <w:jc w:val="center"/>
+            </w:pPr>
+            <w:r/>
+            <w:r>
+              <w:rPr>
+                <w:rFonts w:ascii="Arial" w:hAnsi="Arial"/>
+                <w:b w:val="0"/>
+                <w:sz w:val="12"/>
+              </w:rPr>
+              <w:t>{ckNombrado}</w:t>
+            </w:r>
+          </w:p>
+        </w:tc>
+        <w:tc>
+          <w:tcPr>
+            <w:tcBorders>
+              <w:left w:color="000000" w:space="0" w:sz="4" w:val="single"/>
+              <w:right w:color="000000" w:space="0" w:sz="4" w:val="single"/>
+            </w:tcBorders>
+            <w:vAlign w:val="center"/>
+          </w:tcPr>
+          <w:p>
+            <w:pPr>
               <w:pBdr>
                 <w:top w:space="0" w:sz="0" w:val="nil"/>
                 <w:left w:space="0" w:sz="0" w:val="nil"/>
@@ -638,9 +661,38 @@
             </w:pPr>
             <w:r>
               <w:rPr>
-                <w:rtl w:val="0"/>
-              </w:rPr>
-              <w:t xml:space="preserve">{ckNombrado}</w:t>
+                <w:rFonts w:ascii="Arial" w:cs="Arial" w:eastAsia="Arial" w:hAnsi="Arial"/>
+                <w:color w:val="000000"/>
+                <w:sz w:val="16"/>
+                <w:szCs w:val="16"/>
+                <w:rtl w:val="0"/>
+              </w:rPr>
+              <w:t xml:space="preserve">CAS</w:t>
+            </w:r>
+          </w:p>
+        </w:tc>
+        <w:tc>
+          <w:tcPr>
+            <w:tcBorders>
+              <w:top w:color="000000" w:space="0" w:sz="4" w:val="single"/>
+              <w:left w:color="000000" w:space="0" w:sz="4" w:val="single"/>
+              <w:bottom w:color="000000" w:space="0" w:sz="4" w:val="single"/>
+              <w:right w:color="000000" w:space="0" w:sz="4" w:val="single"/>
+            </w:tcBorders>
+            <w:vAlign w:val="center"/>
+          </w:tcPr>
+          <w:p>
+            <w:pPr>
+              <w:jc w:val="center"/>
+            </w:pPr>
+            <w:r/>
+            <w:r>
+              <w:rPr>
+                <w:rFonts w:ascii="Arial" w:hAnsi="Arial"/>
+                <w:b w:val="0"/>
+                <w:sz w:val="12"/>
+              </w:rPr>
+              <w:t>{ckCAS}</w:t>
             </w:r>
           </w:p>
         </w:tc>
@@ -676,7 +728,7 @@
                 <w:szCs w:val="16"/>
                 <w:rtl w:val="0"/>
               </w:rPr>
-              <w:t xml:space="preserve">CAS</w:t>
+              <w:t xml:space="preserve">O.S / LOCADOR</w:t>
             </w:r>
           </w:p>
         </w:tc>
@@ -692,95 +744,16 @@
           </w:tcPr>
           <w:p>
             <w:pPr>
-              <w:pBdr>
-                <w:top w:space="0" w:sz="0" w:val="nil"/>
-                <w:left w:space="0" w:sz="0" w:val="nil"/>
-                <w:bottom w:space="0" w:sz="0" w:val="nil"/>
-                <w:right w:space="0" w:sz="0" w:val="nil"/>
-                <w:between w:space="0" w:sz="0" w:val="nil"/>
-              </w:pBdr>
-              <w:rPr>
-                <w:rFonts w:ascii="Arial" w:cs="Arial" w:eastAsia="Arial" w:hAnsi="Arial"/>
-                <w:color w:val="000000"/>
-                <w:sz w:val="16"/>
-                <w:szCs w:val="16"/>
-              </w:rPr>
-            </w:pPr>
-            <w:r>
-              <w:rPr>
-                <w:rtl w:val="0"/>
-              </w:rPr>
-              <w:t xml:space="preserve">{ckCAS}</w:t>
-            </w:r>
-          </w:p>
-        </w:tc>
-        <w:tc>
-          <w:tcPr>
-            <w:tcBorders>
-              <w:left w:color="000000" w:space="0" w:sz="4" w:val="single"/>
-              <w:right w:color="000000" w:space="0" w:sz="4" w:val="single"/>
-            </w:tcBorders>
-            <w:vAlign w:val="center"/>
-          </w:tcPr>
-          <w:p>
-            <w:pPr>
-              <w:pBdr>
-                <w:top w:space="0" w:sz="0" w:val="nil"/>
-                <w:left w:space="0" w:sz="0" w:val="nil"/>
-                <w:bottom w:space="0" w:sz="0" w:val="nil"/>
-                <w:right w:space="0" w:sz="0" w:val="nil"/>
-                <w:between w:space="0" w:sz="0" w:val="nil"/>
-              </w:pBdr>
-              <w:rPr>
-                <w:rFonts w:ascii="Arial" w:cs="Arial" w:eastAsia="Arial" w:hAnsi="Arial"/>
-                <w:color w:val="000000"/>
-                <w:sz w:val="16"/>
-                <w:szCs w:val="16"/>
-              </w:rPr>
-            </w:pPr>
-            <w:r>
-              <w:rPr>
-                <w:rFonts w:ascii="Arial" w:cs="Arial" w:eastAsia="Arial" w:hAnsi="Arial"/>
-                <w:color w:val="000000"/>
-                <w:sz w:val="16"/>
-                <w:szCs w:val="16"/>
-                <w:rtl w:val="0"/>
-              </w:rPr>
-              <w:t xml:space="preserve">O.S / LOCADOR</w:t>
-            </w:r>
-          </w:p>
-        </w:tc>
-        <w:tc>
-          <w:tcPr>
-            <w:tcBorders>
-              <w:top w:color="000000" w:space="0" w:sz="4" w:val="single"/>
-              <w:left w:color="000000" w:space="0" w:sz="4" w:val="single"/>
-              <w:bottom w:color="000000" w:space="0" w:sz="4" w:val="single"/>
-              <w:right w:color="000000" w:space="0" w:sz="4" w:val="single"/>
-            </w:tcBorders>
-            <w:vAlign w:val="center"/>
-          </w:tcPr>
-          <w:p>
-            <w:pPr>
-              <w:pBdr>
-                <w:top w:space="0" w:sz="0" w:val="nil"/>
-                <w:left w:space="0" w:sz="0" w:val="nil"/>
-                <w:bottom w:space="0" w:sz="0" w:val="nil"/>
-                <w:right w:space="0" w:sz="0" w:val="nil"/>
-                <w:between w:space="0" w:sz="0" w:val="nil"/>
-              </w:pBdr>
-              <w:rPr>
-                <w:rFonts w:ascii="Arial" w:cs="Arial" w:eastAsia="Arial" w:hAnsi="Arial"/>
-                <w:color w:val="000000"/>
-                <w:sz w:val="16"/>
-                <w:szCs w:val="16"/>
-              </w:rPr>
-            </w:pPr>
-            <w:r>
-              <w:rPr>
-                <w:rtl w:val="0"/>
-              </w:rPr>
-              <w:t xml:space="preserve">{ckLocador}</w:t>
+              <w:jc w:val="center"/>
+            </w:pPr>
+            <w:r/>
+            <w:r>
+              <w:rPr>
+                <w:rFonts w:ascii="Arial" w:hAnsi="Arial"/>
+                <w:b w:val="0"/>
+                <w:sz w:val="12"/>
+              </w:rPr>
+              <w:t>{ckLocador}</w:t>
             </w:r>
           </w:p>
         </w:tc>
@@ -793,29 +766,27 @@
           </w:tcPr>
           <w:p>
             <w:pPr>
-              <w:pBdr>
-                <w:top w:space="0" w:sz="0" w:val="nil"/>
-                <w:left w:space="0" w:sz="0" w:val="nil"/>
-                <w:bottom w:space="0" w:sz="0" w:val="nil"/>
-                <w:right w:space="0" w:sz="0" w:val="nil"/>
-                <w:between w:space="0" w:sz="0" w:val="nil"/>
-              </w:pBdr>
-              <w:rPr>
-                <w:rFonts w:ascii="Arial" w:cs="Arial" w:eastAsia="Arial" w:hAnsi="Arial"/>
-                <w:color w:val="000000"/>
-                <w:sz w:val="16"/>
-                <w:szCs w:val="16"/>
-              </w:rPr>
-            </w:pPr>
-            <w:r>
-              <w:rPr>
-                <w:rFonts w:ascii="Arial" w:cs="Arial" w:eastAsia="Arial" w:hAnsi="Arial"/>
-                <w:color w:val="000000"/>
-                <w:sz w:val="16"/>
-                <w:szCs w:val="16"/>
-                <w:rtl w:val="0"/>
-              </w:rPr>
-              <w:t xml:space="preserve">OTROS</w:t>
+              <w:jc w:val="center"/>
+            </w:pPr>
+            <w:r/>
+            <w:r>
+              <w:rPr>
+                <w:rFonts w:ascii="Arial" w:hAnsi="Arial"/>
+                <w:sz w:val="16"/>
+              </w:rPr>
+              <w:t>OTROS</w:t>
+            </w:r>
+          </w:p>
+          <w:p>
+            <w:pPr>
+              <w:jc w:val="center"/>
+            </w:pPr>
+            <w:r>
+              <w:rPr>
+                <w:rFonts w:ascii="Arial" w:hAnsi="Arial"/>
+                <w:sz w:val="12"/>
+              </w:rPr>
+              <w:t>{ckOtros}</w:t>
             </w:r>
           </w:p>
         </w:tc>
@@ -916,7 +887,6 @@
               <w:rPr>
                 <w:rtl w:val="0"/>
               </w:rPr>
-              <w:t xml:space="preserve">{ckOtros}</w:t>
             </w:r>
           </w:p>
           <w:p>
@@ -1460,7 +1430,7 @@
           <w:szCs w:val="16"/>
           <w:rtl w:val="0"/>
         </w:rPr>
-        <w:t xml:space="preserve">Marcar con una “ X ” de acuerdo al Tipo de Acceso y/o Permiso que se solicite:                       Número de O.S: </w:t>
+        <w:t>Marcar con una “ X ” de acuerdo al Tipo de Acceso y/o Permiso que se solicite:                       Número de O.S: {numeroOS}</w:t>
       </w:r>
     </w:p>
     <w:p>
@@ -1565,27 +1535,20 @@
               <w:bottom w:color="000000" w:space="0" w:sz="4" w:val="single"/>
               <w:right w:color="000000" w:space="0" w:sz="4" w:val="single"/>
             </w:tcBorders>
-          </w:tcPr>
-          <w:p>
-            <w:pPr>
-              <w:pBdr>
-                <w:top w:space="0" w:sz="0" w:val="nil"/>
-                <w:left w:space="0" w:sz="0" w:val="nil"/>
-                <w:bottom w:space="0" w:sz="0" w:val="nil"/>
-                <w:right w:space="0" w:sz="0" w:val="nil"/>
-                <w:between w:space="0" w:sz="0" w:val="nil"/>
-              </w:pBdr>
-              <w:rPr>
-                <w:rFonts w:ascii="Arial" w:cs="Arial" w:eastAsia="Arial" w:hAnsi="Arial"/>
-                <w:color w:val="000000"/>
-                <w:sz w:val="16"/>
-                <w:szCs w:val="16"/>
-              </w:rPr>
-            </w:pPr>
-            <w:r>
-              <w:rPr>
-                <w:rtl w:val="0"/>
-              </w:rPr>
+            <w:vAlign w:val="center"/>
+          </w:tcPr>
+          <w:p>
+            <w:pPr>
+              <w:jc w:val="center"/>
+            </w:pPr>
+            <w:r/>
+            <w:r>
+              <w:rPr>
+                <w:rFonts w:ascii="Arial" w:hAnsi="Arial"/>
+                <w:b w:val="0"/>
+                <w:sz w:val="12"/>
+              </w:rPr>
+              <w:t>{ckAccesoRemoto}</w:t>
             </w:r>
           </w:p>
         </w:tc>
@@ -1685,6 +1648,28 @@
               <w:bottom w:color="000000" w:space="0" w:sz="4" w:val="single"/>
               <w:right w:color="000000" w:space="0" w:sz="4" w:val="single"/>
             </w:tcBorders>
+            <w:vAlign w:val="center"/>
+          </w:tcPr>
+          <w:p>
+            <w:pPr>
+              <w:jc w:val="center"/>
+            </w:pPr>
+            <w:r/>
+            <w:r>
+              <w:rPr>
+                <w:rFonts w:ascii="Arial" w:hAnsi="Arial"/>
+                <w:b w:val="0"/>
+                <w:sz w:val="12"/>
+              </w:rPr>
+              <w:t>{ckUSB}</w:t>
+            </w:r>
+          </w:p>
+        </w:tc>
+        <w:tc>
+          <w:tcPr>
+            <w:tcBorders>
+              <w:left w:color="000000" w:space="0" w:sz="4" w:val="single"/>
+            </w:tcBorders>
           </w:tcPr>
           <w:p>
             <w:pPr>
@@ -1712,11 +1697,15 @@
             </w:r>
           </w:p>
         </w:tc>
-        <w:tc>
-          <w:tcPr>
-            <w:tcBorders>
-              <w:left w:color="000000" w:space="0" w:sz="4" w:val="single"/>
-            </w:tcBorders>
+      </w:tr>
+      <w:tr>
+        <w:trPr>
+          <w:cantSplit w:val="0"/>
+          <w:tblHeader w:val="0"/>
+        </w:trPr>
+        <w:tc>
+          <w:tcPr>
+            <w:gridSpan w:val="3"/>
           </w:tcPr>
           <w:p>
             <w:pPr>
@@ -1743,17 +1732,6 @@
               </w:rPr>
             </w:r>
           </w:p>
-        </w:tc>
-      </w:tr>
-      <w:tr>
-        <w:trPr>
-          <w:cantSplit w:val="0"/>
-          <w:tblHeader w:val="0"/>
-        </w:trPr>
-        <w:tc>
-          <w:tcPr>
-            <w:gridSpan w:val="3"/>
-          </w:tcPr>
           <w:p>
             <w:pPr>
               <w:pBdr>
@@ -1775,67 +1753,32 @@
             </w:pPr>
             <w:r>
               <w:rPr>
-                <w:rtl w:val="0"/>
-              </w:rPr>
-            </w:r>
-          </w:p>
-          <w:p>
-            <w:pPr>
-              <w:pBdr>
-                <w:top w:space="0" w:sz="0" w:val="nil"/>
-                <w:left w:space="0" w:sz="0" w:val="nil"/>
-                <w:bottom w:space="0" w:sz="0" w:val="nil"/>
-                <w:right w:space="0" w:sz="0" w:val="nil"/>
-                <w:between w:space="0" w:sz="0" w:val="nil"/>
-              </w:pBdr>
-              <w:ind w:left="-109" w:firstLine="0"/>
+                <w:rFonts w:ascii="Arial" w:cs="Arial" w:eastAsia="Arial" w:hAnsi="Arial"/>
+                <w:b w:val="1"/>
+                <w:color w:val="000000"/>
+                <w:sz w:val="16"/>
+                <w:szCs w:val="16"/>
+                <w:rtl w:val="0"/>
+              </w:rPr>
+              <w:t xml:space="preserve">SERVICIOS DE ACCESO REMOTO A EQUIPOS</w:t>
+            </w:r>
+          </w:p>
+        </w:tc>
+        <w:tc>
+          <w:tcPr>
+            <w:vAlign w:val="center"/>
+          </w:tcPr>
+          <w:p>
+            <w:pPr>
               <w:jc w:val="center"/>
-              <w:rPr>
-                <w:rFonts w:ascii="Arial" w:cs="Arial" w:eastAsia="Arial" w:hAnsi="Arial"/>
-                <w:b w:val="1"/>
-                <w:color w:val="000000"/>
-                <w:sz w:val="16"/>
-                <w:szCs w:val="16"/>
-              </w:rPr>
-            </w:pPr>
-            <w:r>
-              <w:rPr>
-                <w:rFonts w:ascii="Arial" w:cs="Arial" w:eastAsia="Arial" w:hAnsi="Arial"/>
-                <w:b w:val="1"/>
-                <w:color w:val="000000"/>
-                <w:sz w:val="16"/>
-                <w:szCs w:val="16"/>
-                <w:rtl w:val="0"/>
-              </w:rPr>
-              <w:t xml:space="preserve">SERVICIOS DE ACCESO REMOTO A EQUIPOS</w:t>
-            </w:r>
-          </w:p>
-        </w:tc>
-        <w:tc>
-          <w:tcPr/>
-          <w:p>
-            <w:pPr>
-              <w:pBdr>
-                <w:top w:space="0" w:sz="0" w:val="nil"/>
-                <w:left w:space="0" w:sz="0" w:val="nil"/>
-                <w:bottom w:space="0" w:sz="0" w:val="nil"/>
-                <w:right w:space="0" w:sz="0" w:val="nil"/>
-                <w:between w:space="0" w:sz="0" w:val="nil"/>
-              </w:pBdr>
-              <w:ind w:left="-109" w:firstLine="0"/>
-              <w:rPr>
-                <w:rFonts w:ascii="Arial" w:cs="Arial" w:eastAsia="Arial" w:hAnsi="Arial"/>
-                <w:b w:val="1"/>
-                <w:color w:val="000000"/>
-                <w:sz w:val="16"/>
-                <w:szCs w:val="16"/>
-              </w:rPr>
-            </w:pPr>
-            <w:r>
-              <w:rPr>
-                <w:rtl w:val="0"/>
-              </w:rPr>
-              <w:t xml:space="preserve">{ckAccesoRemoto}</w:t>
+            </w:pPr>
+            <w:r/>
+            <w:r>
+              <w:rPr>
+                <w:rFonts w:ascii="Arial" w:hAnsi="Arial"/>
+                <w:b w:val="0"/>
+                <w:sz w:val="12"/>
+              </w:rPr>
             </w:r>
           </w:p>
         </w:tc>
@@ -7095,18 +7038,16 @@
           </w:tcPr>
           <w:p>
             <w:pPr>
-              <w:widowControl w:val="0"/>
-              <w:spacing w:after="0" w:line="276" w:lineRule="auto"/>
-              <w:rPr>
-                <w:rFonts w:ascii="Arial" w:cs="Arial" w:eastAsia="Arial" w:hAnsi="Arial"/>
-                <w:sz w:val="20"/>
-                <w:szCs w:val="20"/>
-              </w:rPr>
-            </w:pPr>
-            <w:r>
-              <w:rPr>
-                <w:rtl w:val="0"/>
-              </w:rPr>
+              <w:jc w:val="center"/>
+            </w:pPr>
+            <w:r/>
+            <w:r>
+              <w:rPr>
+                <w:rFonts w:ascii="Arial" w:hAnsi="Arial"/>
+                <w:b w:val="0"/>
+                <w:sz w:val="14"/>
+              </w:rPr>
+              <w:t>1</w:t>
             </w:r>
           </w:p>
         </w:tc>
@@ -7129,18 +7070,16 @@
           </w:tcPr>
           <w:p>
             <w:pPr>
-              <w:widowControl w:val="0"/>
-              <w:spacing w:after="0" w:line="276" w:lineRule="auto"/>
-              <w:rPr>
-                <w:rFonts w:ascii="Arial" w:cs="Arial" w:eastAsia="Arial" w:hAnsi="Arial"/>
-                <w:sz w:val="20"/>
-                <w:szCs w:val="20"/>
-              </w:rPr>
-            </w:pPr>
-            <w:r>
-              <w:rPr>
-                <w:rtl w:val="0"/>
-              </w:rPr>
+              <w:jc w:val="center"/>
+            </w:pPr>
+            <w:r/>
+            <w:r>
+              <w:rPr>
+                <w:rFonts w:ascii="Arial" w:hAnsi="Arial"/>
+                <w:b w:val="0"/>
+                <w:sz w:val="14"/>
+              </w:rPr>
+              <w:t>{nombres}</w:t>
             </w:r>
           </w:p>
         </w:tc>
@@ -7163,18 +7102,16 @@
           </w:tcPr>
           <w:p>
             <w:pPr>
-              <w:widowControl w:val="0"/>
-              <w:spacing w:after="0" w:line="276" w:lineRule="auto"/>
-              <w:rPr>
-                <w:rFonts w:ascii="Arial" w:cs="Arial" w:eastAsia="Arial" w:hAnsi="Arial"/>
-                <w:sz w:val="20"/>
-                <w:szCs w:val="20"/>
-              </w:rPr>
-            </w:pPr>
-            <w:r>
-              <w:rPr>
-                <w:rtl w:val="0"/>
-              </w:rPr>
+              <w:jc w:val="center"/>
+            </w:pPr>
+            <w:r/>
+            <w:r>
+              <w:rPr>
+                <w:rFonts w:ascii="Arial" w:hAnsi="Arial"/>
+                <w:b w:val="0"/>
+                <w:sz w:val="14"/>
+              </w:rPr>
+              <w:t>{usuarioRed}</w:t>
             </w:r>
           </w:p>
         </w:tc>
@@ -7197,20 +7134,16 @@
           </w:tcPr>
           <w:p>
             <w:pPr>
-              <w:widowControl w:val="0"/>
-              <w:spacing w:after="0" w:line="276" w:lineRule="auto"/>
               <w:jc w:val="center"/>
-              <w:rPr>
-                <w:rFonts w:ascii="Times New Roman" w:cs="Times New Roman" w:eastAsia="Times New Roman" w:hAnsi="Times New Roman"/>
-                <w:color w:val="1f497d"/>
-                <w:sz w:val="20"/>
-                <w:szCs w:val="20"/>
-              </w:rPr>
-            </w:pPr>
-            <w:r>
-              <w:rPr>
-                <w:rtl w:val="0"/>
-              </w:rPr>
+            </w:pPr>
+            <w:r/>
+            <w:r>
+              <w:rPr>
+                <w:rFonts w:ascii="Arial" w:hAnsi="Arial"/>
+                <w:b w:val="0"/>
+                <w:sz w:val="14"/>
+              </w:rPr>
+              <w:t>{ipOpcional}</w:t>
             </w:r>
           </w:p>
         </w:tc>
@@ -7233,19 +7166,16 @@
           </w:tcPr>
           <w:p>
             <w:pPr>
-              <w:widowControl w:val="0"/>
-              <w:spacing w:after="0" w:line="276" w:lineRule="auto"/>
               <w:jc w:val="center"/>
-              <w:rPr>
-                <w:rFonts w:ascii="Arial" w:cs="Arial" w:eastAsia="Arial" w:hAnsi="Arial"/>
-                <w:sz w:val="20"/>
-                <w:szCs w:val="20"/>
-              </w:rPr>
-            </w:pPr>
-            <w:r>
-              <w:rPr>
-                <w:rtl w:val="0"/>
-              </w:rPr>
+            </w:pPr>
+            <w:r/>
+            <w:r>
+              <w:rPr>
+                <w:rFonts w:ascii="Arial" w:hAnsi="Arial"/>
+                <w:b w:val="0"/>
+                <w:sz w:val="14"/>
+              </w:rPr>
+              <w:t>{correoPersonal}</w:t>
             </w:r>
           </w:p>
         </w:tc>
@@ -7268,19 +7198,16 @@
           </w:tcPr>
           <w:p>
             <w:pPr>
-              <w:widowControl w:val="0"/>
-              <w:spacing w:after="0" w:line="276" w:lineRule="auto"/>
               <w:jc w:val="center"/>
-              <w:rPr>
-                <w:rFonts w:ascii="Arial" w:cs="Arial" w:eastAsia="Arial" w:hAnsi="Arial"/>
-                <w:sz w:val="20"/>
-                <w:szCs w:val="20"/>
-              </w:rPr>
-            </w:pPr>
-            <w:r>
-              <w:rPr>
-                <w:rtl w:val="0"/>
-              </w:rPr>
+            </w:pPr>
+            <w:r/>
+            <w:r>
+              <w:rPr>
+                <w:rFonts w:ascii="Arial" w:hAnsi="Arial"/>
+                <w:b w:val="0"/>
+                <w:sz w:val="14"/>
+              </w:rPr>
+              <w:t>{hostEquipo}</w:t>
             </w:r>
           </w:p>
         </w:tc>
@@ -7303,19 +7230,16 @@
           </w:tcPr>
           <w:p>
             <w:pPr>
-              <w:widowControl w:val="0"/>
-              <w:spacing w:after="0" w:line="276" w:lineRule="auto"/>
               <w:jc w:val="center"/>
-              <w:rPr>
-                <w:rFonts w:ascii="Arial" w:cs="Arial" w:eastAsia="Arial" w:hAnsi="Arial"/>
-                <w:sz w:val="20"/>
-                <w:szCs w:val="20"/>
-              </w:rPr>
-            </w:pPr>
-            <w:r>
-              <w:rPr>
-                <w:rtl w:val="0"/>
-              </w:rPr>
+            </w:pPr>
+            <w:r/>
+            <w:r>
+              <w:rPr>
+                <w:rFonts w:ascii="Arial" w:hAnsi="Arial"/>
+                <w:b w:val="0"/>
+                <w:sz w:val="14"/>
+              </w:rPr>
+              <w:t>{telefono}</w:t>
             </w:r>
           </w:p>
         </w:tc>

</xml_diff>